<commit_message>
nc72: supplementary figures renumbered to strict first-citation order (1,9,2,3,6,4,8,5,7 -> 1..9); STAGE figure_S*.pdf renamed; MS/SI/Guide refs + SI legends reordered; assertion chain synced (build 226, XV8 64, CL+Guide 44, pytest 29)
</commit_message>
<xml_diff>
--- a/CKI_Submission_NC/CKI_Manuscript_NC.docx
+++ b/CKI_Submission_NC/CKI_Manuscript_NC.docx
@@ -743,7 +743,7 @@
           <w:color w:val="000000"/>
           <w:sz w:val="22"/>
         </w:rPr>
-        <w:t>A scoped framework formalizes the decomposition (Supplementary Note 20): under a factor model for log-expression, global scale cancels exactly (Lemma 1), and a second-order expansion of JS divergence with explicit remainder (Lemma 2) gives ω = α + E_f/E_b + ε, with E_f and E_b the functional and background displacement energies and α the selection constant estimated by the split-half baseline (Proposition 3). ω thus reads as functional signal relative to the pair’s own background, increases monotonically with functional change where the expansion holds (Proposition 4; ground-truth ρ = 0.688), and carries second-order-small calibration bias (Proposition 5, &lt; 0.8%); the expansion is quantitative at the k_n scale and approximate at the k_f scale (Supplementary Fig. 9).</w:t>
+        <w:t>A scoped framework formalizes the decomposition (Supplementary Note 20): under a factor model for log-expression, global scale cancels exactly (Lemma 1), and a second-order expansion of JS divergence with explicit remainder (Lemma 2) gives ω = α + E_f/E_b + ε, with E_f and E_b the functional and background displacement energies and α the selection constant estimated by the split-half baseline (Proposition 3). ω thus reads as functional signal relative to the pair’s own background, increases monotonically with functional change where the expansion holds (Proposition 4; ground-truth ρ = 0.688), and carries second-order-small calibration bias (Proposition 5, &lt; 0.8%); the expansion is quantitative at the k_n scale and approximate at the k_f scale (Supplementary Fig. 2).</w:t>
       </w:r>
     </w:p>
     <w:p>
@@ -864,7 +864,7 @@
           <w:color w:val="000000"/>
           <w:sz w:val="22"/>
         </w:rPr>
-        <w:t>Because the empirical baseline deviates from the theoretical ideal (ω = 1), we introduce ω_cal = ω_obs / 7.70 (one-significant-digit resolution). The factor is dataset-relative (brain atlas 9.73; Tabula Sapiens 7.67, indicative only; Supplementary Fig. 2); class-specific baselines leave the astrocyte-to-Bergmann-glia gradient essentially unchanged, and a ratio-estimator audit confirms the calibration absorbs ratio bias (Supplementary Notes 2–4).</w:t>
+        <w:t>Because the empirical baseline deviates from the theoretical ideal (ω = 1), we introduce ω_cal = ω_obs / 7.70 (one-significant-digit resolution). The factor is dataset-relative (brain atlas 9.73; Tabula Sapiens 7.67, indicative only; Supplementary Fig. 3); class-specific baselines leave the astrocyte-to-Bergmann-glia gradient essentially unchanged, and a ratio-estimator audit confirms the calibration absorbs ratio bias (Supplementary Notes 2–4).</w:t>
       </w:r>
     </w:p>
     <w:p>
@@ -1174,7 +1174,7 @@
           <w:color w:val="000000"/>
           <w:sz w:val="22"/>
         </w:rPr>
-        <w:t xml:space="preserve"> (91,838 nuclei; n = 35) separate cleanly from neutral half-splits (n = 40; ω 21.83 ± 7.20 versus 1.30 ± 0.36; Mann-Whitney P = 5.5 × 10⁻¹⁴, descriptive; AUC = 1.00), the margin carried by k_f (Supplementary Note 7; Supplementary Fig. 3).</w:t>
+        <w:t xml:space="preserve"> (91,838 nuclei; n = 35) separate cleanly from neutral half-splits (n = 40; ω 21.83 ± 7.20 versus 1.30 ± 0.36; Mann-Whitney P = 5.5 × 10⁻¹⁴, descriptive; AUC = 1.00), the margin carried by k_f (Supplementary Note 7; Supplementary Fig. 4).</w:t>
       </w:r>
     </w:p>
     <w:p>
@@ -1226,7 +1226,7 @@
           <w:color w:val="000000"/>
           <w:sz w:val="22"/>
         </w:rPr>
-        <w:t xml:space="preserve"> (24,413 cells, six cell types; Methods), condition fully confounded with lane—the perturbation was visible at the ω level in all six cell types, but k_f alone separated perturbation from donor drift as well or better (rank AUC: ω 0.55–0.92, k_f 0.74–1.00); in CD14+ monocytes ω fell to 0.55 while k_f retained 0.98, because stimulation raises housekeeping expression itself (median k_n 1.2–5.7-fold), partially cancelling the functional signal (Supplementary Fig. 3; Supplementary Note 8). Second, benchmarking against MELD (v1.0.2) and scDist (Python approximation) on the same dataset </w:t>
+        <w:t xml:space="preserve"> (24,413 cells, six cell types; Methods), condition fully confounded with lane—the perturbation was visible at the ω level in all six cell types, but k_f alone separated perturbation from donor drift as well or better (rank AUC: ω 0.55–0.92, k_f 0.74–1.00); in CD14+ monocytes ω fell to 0.55 while k_f retained 0.98, because stimulation raises housekeeping expression itself (median k_n 1.2–5.7-fold), partially cancelling the functional signal (Supplementary Fig. 4; Supplementary Note 8). Second, benchmarking against MELD (v1.0.2) and scDist (Python approximation) on the same dataset </w:t>
       </w:r>
       <w:r>
         <w:rPr>
@@ -1299,7 +1299,7 @@
           <w:color w:val="000000"/>
           <w:sz w:val="22"/>
         </w:rPr>
-        <w:t>, totalling 3,535 samples, comparing tumor–tumor (TT), normal–normal (NN), and tumor–normal pairs within each type (Fig. 3; Supplementary Fig. 2). A pan-cancer reversal emerged: NN pairs were more divergent than TT pairs in all five (mean NN/TT ω: LUAD 2.46, KIRC 1.88, LUSC 1.71, BRCA 1.57, LIHC 1.11; cluster-bootstrap CI excluding 1 in four of five, LIHC excepted; Supplementary Table 5). All TCGA results exclude 32 cell-line-derived aliquots found by barcode audit (Supplementary Methods 5.3). Decomposition identified the mechanism: TT k_n exceeded NN k_n by 1.3–3.3-fold in every cancer type while TT k_f was equal to or higher—the reversal reflects a more stable housekeeping baseline among adjacent non-tumor specimens, not smaller functional-gene divergence of tumor cells (Fig. 3a).</w:t>
+        <w:t>, totalling 3,535 samples, comparing tumor–tumor (TT), normal–normal (NN), and tumor–normal pairs within each type (Fig. 3; Supplementary Fig. 3). A pan-cancer reversal emerged: NN pairs were more divergent than TT pairs in all five (mean NN/TT ω: LUAD 2.46, KIRC 1.88, LUSC 1.71, BRCA 1.57, LIHC 1.11; cluster-bootstrap CI excluding 1 in four of five, LIHC excepted; Supplementary Table 5). All TCGA results exclude 32 cell-line-derived aliquots found by barcode audit (Supplementary Methods 5.3). Decomposition identified the mechanism: TT k_n exceeded NN k_n by 1.3–3.3-fold in every cancer type while TT k_f was equal to or higher—the reversal reflects a more stable housekeeping baseline among adjacent non-tumor specimens, not smaller functional-gene divergence of tumor cells (Fig. 3a).</w:t>
       </w:r>
     </w:p>
     <w:p>
@@ -1399,7 +1399,7 @@
           <w:color w:val="000000"/>
           <w:sz w:val="22"/>
         </w:rPr>
-        <w:t xml:space="preserve">Of the 4,851 Tabula Sapiens pairs, 59 are same-cell-type cross-organ comparisons (Fig. 4; Table 1; Supplementary Fig. 6). Among well-sampled types (n ≥ 5 pairs; Table 1), CD8+ T cells (mean ω = 9.93 ± 4.62, n = 6) and Plasma cells (mean ω = 10.20 ± 2.03, n = 6) were the most conserved, followed by Neutrophils and NK cells, with Macrophages (n = 15) intermediate; Endothelial cells and Erythrocytes were the most divergent, consistent with organ-specific endothelial programs </w:t>
+        <w:t xml:space="preserve">Of the 4,851 Tabula Sapiens pairs, 59 are same-cell-type cross-organ comparisons (Fig. 4; Table 1; Supplementary Fig. 5). Among well-sampled types (n ≥ 5 pairs; Table 1), CD8+ T cells (mean ω = 9.93 ± 4.62, n = 6) and Plasma cells (mean ω = 10.20 ± 2.03, n = 6) were the most conserved, followed by Neutrophils and NK cells, with Macrophages (n = 15) intermediate; Endothelial cells and Erythrocytes were the most divergent, consistent with organ-specific endothelial programs </w:t>
       </w:r>
       <w:r>
         <w:rPr>
@@ -1488,7 +1488,7 @@
           <w:color w:val="000000"/>
           <w:sz w:val="22"/>
         </w:rPr>
-        <w:t xml:space="preserve"> (~3.3 million nuclei, 108 regions), focusing on 888,263 non-neuronal nuclei in 10 major classes (supercluster_term does not resolve neuronal subtypes). ω was computed for all same-cell-type cross-region pairs (31,764; Fig. 5; Supplementary Fig. 4; Supplementary Table 10); vascular cells and fibroblasts are heterogeneous superclusters (class-level ω = supercluster averages).</w:t>
+        <w:t xml:space="preserve"> (~3.3 million nuclei, 108 regions), focusing on 888,263 non-neuronal nuclei in 10 major classes (supercluster_term does not resolve neuronal subtypes). ω was computed for all same-cell-type cross-region pairs (31,764; Fig. 5; Supplementary Fig. 6; Supplementary Table 10); vascular cells and fibroblasts are heterogeneous superclusters (class-level ω = supercluster averages).</w:t>
       </w:r>
     </w:p>
     <w:p>
@@ -1504,7 +1504,7 @@
           <w:color w:val="000000"/>
           <w:sz w:val="22"/>
         </w:rPr>
-        <w:t>The neuronal superclass tier shows the complementary pattern: mean ω 63.5–69.3 (2,995 pairs) versus non-neuronal median 24.5 excluding astrocytes; two of three superclasses exceed their design-matched block-shuffle nulls (P = 0.001, 0.014, 0.163), so the non-neuronal screen understates atlas-wide divergence (Fig. 5e, f; Supplementary Note 18; Supplementary Fig. 8; Supplementary Table 11).</w:t>
+        <w:t>The neuronal superclass tier shows the complementary pattern: mean ω 63.5–69.3 (2,995 pairs) versus non-neuronal median 24.5 excluding astrocytes; two of three superclasses exceed their design-matched block-shuffle nulls (P = 0.001, 0.014, 0.163), so the non-neuronal screen understates atlas-wide divergence (Fig. 5e, f; Supplementary Note 18; Supplementary Fig. 7; Supplementary Table 11).</w:t>
       </w:r>
     </w:p>
     <w:p>
@@ -1552,7 +1552,7 @@
           <w:color w:val="000000"/>
           <w:sz w:val="22"/>
         </w:rPr>
-        <w:t>Three analyses probe robustness. First, same-donor region pairs preserve the extremes and a 4.50-fold gradient (Supplementary Note 12). Second, the astrocyte-versus-Bergmann-glia contrast is predominantly a k_n effect (k_f differs 2.0-fold; mean k_n 3.2-fold; pair-level variability: Supplementary Fig. 4): class-mean ω tracks k_n (ρ = −0.73) but not k_f (ρ = 0.09), and under a k_f-only ordering astrocytes rank third of ten.</w:t>
+        <w:t>Three analyses probe robustness. First, same-donor region pairs preserve the extremes and a 4.50-fold gradient (Supplementary Note 12). Second, the astrocyte-versus-Bergmann-glia contrast is predominantly a k_n effect (k_f differs 2.0-fold; mean k_n 3.2-fold; pair-level variability: Supplementary Fig. 6): class-mean ω tracks k_n (ρ = −0.73) but not k_f (ρ = 0.09), and under a k_f-only ordering astrocytes rank third of ten.</w:t>
       </w:r>
     </w:p>
     <w:p>
@@ -1710,7 +1710,7 @@
           <w:color w:val="000000"/>
           <w:sz w:val="22"/>
         </w:rPr>
-        <w:t>The screen uses a multiplicative model, expected_ω = μ_ct × μ_pair / μ_grand, with three residual tiers: Strong (&lt; 0.3, ω &lt; 15, lowest ω in the pair), Moderate (&lt; 0.5, ω &lt; 25), Weak (&lt; 0.75, ω &lt; 35; Methods; Supplementary Fig. 5).</w:t>
+        <w:t>The screen uses a multiplicative model, expected_ω = μ_ct × μ_pair / μ_grand, with three residual tiers: Strong (&lt; 0.3, ω &lt; 15, lowest ω in the pair), Moderate (&lt; 0.5, ω &lt; 25), Weak (&lt; 0.75, ω &lt; 35; Methods; Supplementary Fig. 8).</w:t>
       </w:r>
     </w:p>
     <w:p>
@@ -1726,7 +1726,7 @@
           <w:color w:val="000000"/>
           <w:sz w:val="22"/>
         </w:rPr>
-        <w:t>Criteria identified 39 (0.12%) Strong, 1,171 (3.69%) Moderate, and 5,381 (16.94%) Weak candidates among 31,764 comparisons (Supplementary Tables 12, 13). Under the block-shuffle null (B = 1,000; Supplementary Fig. 5), 31 Strong candidates showed raw P &lt; 0.05; the only sub-nominal stratified family is intra-cerebellar Bergmann-glia (m = 21; within-family minimum q = 0.042). The microglial concentration (16 Strong) does not survive the design-matched null (fold 0.31, P = 0.990): we make no class-composition claim.</w:t>
+        <w:t>Criteria identified 39 (0.12%) Strong, 1,171 (3.69%) Moderate, and 5,381 (16.94%) Weak candidates among 31,764 comparisons (Supplementary Tables 12, 13). Under the block-shuffle null (B = 1,000; Supplementary Fig. 8), 31 Strong candidates showed raw P &lt; 0.05; the only sub-nominal stratified family is intra-cerebellar Bergmann-glia (m = 21; within-family minimum q = 0.042). The microglial concentration (16 Strong) does not survive the design-matched null (fold 0.31, P = 0.990): we make no class-composition claim.</w:t>
       </w:r>
     </w:p>
     <w:p>
@@ -1742,7 +1742,7 @@
           <w:color w:val="000000"/>
           <w:sz w:val="22"/>
         </w:rPr>
-        <w:t>A pseudo-region negative control (127,756 pseudo-pairs) confirms the null is calibrated by library-level, not regional, structure (near-nominal cross-region tail rates; Supplementary Note 12; Supplementary Fig. 6).</w:t>
+        <w:t>A pseudo-region negative control (127,756 pseudo-pairs) confirms the null is calibrated by library-level, not regional, structure (near-nominal cross-region tail rates; Supplementary Note 12; Supplementary Fig. 5).</w:t>
       </w:r>
     </w:p>
     <w:p>
@@ -2153,7 +2153,7 @@
           <w:color w:val="000000"/>
           <w:sz w:val="22"/>
         </w:rPr>
-        <w:t xml:space="preserve">The cross-organ and cross-brain-region analyses show CKI measuring functional differentiation across spatial scales, though the brain gradient, extended into neuronal superclasses (Results), is k_n-dominated rather than a pure functional-divergence ranking. The candidate screen reiterates that atlas-scale claims require design-respecting nulls (Results). Cross-species transfer remains unestablished (r = −0.17, P = 0.55; Supplementary Fig. 6) </w:t>
+        <w:t xml:space="preserve">The cross-organ and cross-brain-region analyses show CKI measuring functional differentiation across spatial scales, though the brain gradient, extended into neuronal superclasses (Results), is k_n-dominated rather than a pure functional-divergence ranking. The candidate screen reiterates that atlas-scale claims require design-respecting nulls (Results). Cross-species transfer remains unestablished (r = −0.17, P = 0.55; Supplementary Fig. 5) </w:t>
       </w:r>
       <w:r>
         <w:rPr>
@@ -2232,7 +2232,7 @@
           <w:color w:val="000000"/>
           <w:sz w:val="22"/>
         </w:rPr>
-        <w:t xml:space="preserve"> at the axis-anatomy level only. k_f also recapitulated Cell Ontology lineage distance in two independent atlases (both permutation P = 1.0 × 10⁻⁴; Supplementary Note 17; Supplementary Fig. 7), unlike k_n or ω. External disease anchors behave directionally but sub-threshold: in SEA-AD, pan-reactive-astrocyte and disease-associated-microglia sets elevate ω in high-ADNC donors (P = 0.015/0.041, negative controls at the null, minimum q = 0.145), and no Hallmark program concentrates the signal (0 of 400; Supplementary Note 19; Supplementary Fig. 8; Supplementary Table 14).</w:t>
+        <w:t xml:space="preserve"> at the axis-anatomy level only. k_f also recapitulated Cell Ontology lineage distance in two independent atlases (both permutation P = 1.0 × 10⁻⁴; Supplementary Note 17; Supplementary Fig. 9), unlike k_n or ω. External disease anchors behave directionally but sub-threshold: in SEA-AD, pan-reactive-astrocyte and disease-associated-microglia sets elevate ω in high-ADNC donors (P = 0.015/0.041, negative controls at the null, minimum q = 0.145), and no Hallmark program concentrates the signal (0 of 400; Supplementary Note 19; Supplementary Fig. 7; Supplementary Table 14).</w:t>
       </w:r>
     </w:p>
     <w:p>
@@ -6936,7 +6936,7 @@
           <w:color w:val="000000"/>
           <w:sz w:val="22"/>
         </w:rPr>
-        <w:t>Figure 5. Brain regional cell-type differentiation, region-association inference, and neuronal superclass divergence. (a) Brain region map schematic showing anatomical regions analyzed in the Siletti et al. atlas. (b) ω gradient across 10 non-neuronal cell classes (mean ω per class, block-shuffle observed landscape): Bergmann glia and vascular cells lowest (mean ω = 13.56), astrocytes highest (82.75); the 6.10-fold raw gradient is an uncorrected upper bound, and the combined span- and size-matched control gives 3.66-fold observed (donor-level bootstrap median 3.28, 95% CI [1.92, 3.78]) (Supplementary Note 11), and the signal is dominated by the k_n denominator (3.21-fold k_n versus 2.03-fold k_f at the endpoint contrast; see Results). (c) Region-associated candidate detection: the multiplicative residual model identifies 39 Strong candidates (residual &lt; 0.3, ω &lt; 15, lowest ω in pair) among 31,764 cross-region comparisons; a design-matched null expects 148.3, so the observed 39 are anti-enriched (P(null count ≥ 39) = 1.0), none survives FDR correction, and only 3 of 39 are retained under a global-k_n estimator—the catalogue is hypothesis-generating. (d) Observed vs. expected ω for the five strongest Strong candidates across all cell classes (lowest residuals), showing the gap between observed regional similarity and the cell-type-specific expectation. (e) Sample-level block-shuffle null for the three neuronal superclasses (grey violins, B = 1,000 permutations preserving the per-region library-count multiset; dark dash = null mean; red dot = observed mean regional ω): MGE interneurons sit at the permutation floor (P = 0.001, SES = 7.2); upper-layer intratelencephalic neurons P = 0.014; thalamic excitatory neurons P = 0.163. (f) Median pair ω across the three neuronal superclasses (purple) and the ten non-neuronal classes (grey; astrocytes highlighted in red): neuronal medians 59.3–64.2 versus a non-neuronal median of 24.5 excluding astrocytes (descriptive cross-class contrast: one-sided Mann–Whitney z = 52.6, P &lt; 10⁻³⁰⁰, pseudoreplicated at the pair level), so the non-neuronal screen understates atlas-wide regional divergence (Supplementary Note 18; Supplementary Fig. 8; Supplementary Table 11).</w:t>
+        <w:t>Figure 5. Brain regional cell-type differentiation, region-association inference, and neuronal superclass divergence. (a) Brain region map schematic showing anatomical regions analyzed in the Siletti et al. atlas. (b) ω gradient across 10 non-neuronal cell classes (mean ω per class, block-shuffle observed landscape): Bergmann glia and vascular cells lowest (mean ω = 13.56), astrocytes highest (82.75); the 6.10-fold raw gradient is an uncorrected upper bound, and the combined span- and size-matched control gives 3.66-fold observed (donor-level bootstrap median 3.28, 95% CI [1.92, 3.78]) (Supplementary Note 11), and the signal is dominated by the k_n denominator (3.21-fold k_n versus 2.03-fold k_f at the endpoint contrast; see Results). (c) Region-associated candidate detection: the multiplicative residual model identifies 39 Strong candidates (residual &lt; 0.3, ω &lt; 15, lowest ω in pair) among 31,764 cross-region comparisons; a design-matched null expects 148.3, so the observed 39 are anti-enriched (P(null count ≥ 39) = 1.0), none survives FDR correction, and only 3 of 39 are retained under a global-k_n estimator—the catalogue is hypothesis-generating. (d) Observed vs. expected ω for the five strongest Strong candidates across all cell classes (lowest residuals), showing the gap between observed regional similarity and the cell-type-specific expectation. (e) Sample-level block-shuffle null for the three neuronal superclasses (grey violins, B = 1,000 permutations preserving the per-region library-count multiset; dark dash = null mean; red dot = observed mean regional ω): MGE interneurons sit at the permutation floor (P = 0.001, SES = 7.2); upper-layer intratelencephalic neurons P = 0.014; thalamic excitatory neurons P = 0.163. (f) Median pair ω across the three neuronal superclasses (purple) and the ten non-neuronal classes (grey; astrocytes highlighted in red): neuronal medians 59.3–64.2 versus a non-neuronal median of 24.5 excluding astrocytes (descriptive cross-class contrast: one-sided Mann–Whitney z = 52.6, P &lt; 10⁻³⁰⁰, pseudoreplicated at the pair level), so the non-neuronal screen understates atlas-wide regional divergence (Supplementary Note 18; Supplementary Fig. 7; Supplementary Table 11).</w:t>
       </w:r>
     </w:p>
     <w:p>

</xml_diff>

<commit_message>
nc76: answer all must-answer reviewer questions — IFN-b A1 anatomy quantification, brain power/fixed-panel/alt-HK sensitivity, KRAS AUC vs DE benchmark, time-varying Cox, SEA-AD dose-response, DA-method positioning, B=1000 rationale; honest disclosures (alt-HK panel dependence, no DE increment)
</commit_message>
<xml_diff>
--- a/CKI_Submission_NC/CKI_Manuscript_NC.docx
+++ b/CKI_Submission_NC/CKI_Manuscript_NC.docx
@@ -1247,7 +1247,7 @@
           <w:color w:val="000000"/>
           <w:sz w:val="22"/>
         </w:rPr>
-        <w:t>: CKI and MELD agreed on effect direction in 6 of 6 cell types, but MELD’s within-type separation was near-saturated (AUC 0.997–0.9998), and in an additive mean-shift simulation both detected every configuration, whereas CKI ω rose from AUC 0.52 to 0.79 on 100-gene shifts but collapsed to 0.05–0.13 on 500 genes, where the anchor responds (k_n AUC = 1.000)—for maximal power on broad perturbations use MELD, scDist, or CKI’s own k_f. Third, non-circular panels left rankings untouched (pair-level ρ = 0.937 leave-pair-out, 0.918–0.931 other panels; class means ρ = 0.90–0.99), and the astrocyte-to-Bergmann-glia gradient was preserved and amplified (6.10-fold reported; 6.53-fold leave-pair-out), with class-level significance robust (Supplementary Note 9); circular selection inflated k_f by a median 1.61-fold versus leave-pair-out (grand mean ω 38.55; 26.5 leave-pair-out; 6.5 fixed), so absolute ω values are upper-bound, scheme-specific estimates: rank-based conclusions are robust, but the tier cutoffs (ω &lt; 15/25/35) do not transfer.</w:t>
+        <w:t>: CKI and MELD agreed on effect direction in 6 of 6 cell types, but MELD’s within-type separation was near-saturated (AUC 0.997–0.9998), and in an additive mean-shift simulation both detected every configuration, whereas CKI ω rose from AUC 0.52 to 0.79 on 100-gene shifts but collapsed to 0.05–0.13 on 500 genes, where the anchor responds (k_n AUC = 1.000)—for maximal power on broad perturbations use MELD, scDist, or CKI’s own k_f. Third, non-circular panels left rankings untouched (pair-level ρ = 0.937 leave-pair-out, 0.918–0.931 other panels; class means ρ = 0.90–0.99), and the astrocyte-to-Bergmann-glia gradient was preserved and amplified (6.10-fold reported; 6.53-fold leave-pair-out), with class-level significance robust (Supplementary Note 9); circular selection inflated k_f by a median 1.61-fold versus leave-pair-out, so absolute ω values are upper-bound, scheme-specific estimates: rank-based conclusions are robust, but the tier cutoffs (ω &lt; 15/25/35) do not transfer.</w:t>
       </w:r>
     </w:p>
     <w:p>
@@ -1299,7 +1299,7 @@
           <w:color w:val="000000"/>
           <w:sz w:val="22"/>
         </w:rPr>
-        <w:t>, totalling 3,535 samples, comparing tumor–tumor (TT), normal–normal (NN), and tumor–normal pairs within each type (Fig. 3; Supplementary Fig. 3). A pan-cancer reversal emerged: NN pairs were more divergent than TT pairs in all five (mean NN/TT ω: LUAD 2.46, KIRC 1.88, LUSC 1.71, BRCA 1.57, LIHC 1.11; cluster-bootstrap CI excluding 1 in four of five, LIHC excepted; Supplementary Table 5). All TCGA results exclude 32 cell-line-derived aliquots found by barcode audit (Supplementary Methods 5.3). Decomposition identified the mechanism: TT k_n exceeded NN k_n by 1.3–3.3-fold in every cancer type while TT k_f was equal to or higher—the reversal reflects a more stable housekeeping baseline among adjacent non-tumor specimens, not smaller functional-gene divergence of tumor cells (Fig. 3a).</w:t>
+        <w:t>, totalling 3,535 samples, comparing tumor–tumor (TT), normal–normal (NN), and tumor–normal pairs within each type (Fig. 3; Supplementary Fig. 3). A pan-cancer reversal emerged: NN pairs were more divergent than TT pairs in all five (mean NN/TT ω: LUAD 2.46, KIRC 1.88, LUSC 1.71, BRCA 1.57, LIHC 1.11; cluster-bootstrap CI excluding 1 in four of five, LIHC excepted; Supplementary Table 5). All TCGA results exclude 32 cell-line-derived aliquots found by barcode audit (LIHC NN/TT 1.104 with versus 1.112 without them; Supplementary Methods 5.3). Decomposition identified the mechanism: TT k_n exceeded NN k_n by 1.3–3.3-fold in every cancer type while TT k_f was equal to or higher—the reversal reflects a more stable housekeeping baseline among adjacent non-tumor specimens, not smaller functional-gene divergence of tumor cells (Fig. 3a).</w:t>
       </w:r>
     </w:p>
     <w:p>
@@ -1331,7 +1331,7 @@
           <w:color w:val="000000"/>
           <w:sz w:val="22"/>
         </w:rPr>
-        <w:t xml:space="preserve">Four controls bound the interpretation (Supplementary Note 10). Composition adjustment left the pooled tumor-pair k_n coefficient unchanged (−0.9% pooled, 95% CI −4.3% to +2.5%), and high-purity-half comparisons increased the NN/TT ratio in all five, so admixture can only weaken, not create, the elevation. All TCGA statistics were recomputed under the authoritative linear probability mapping (Section 1.7); only LIHC is mapping-sensitive (linear 1.11 [0.94, 1.30] versus softmax 1.29 [1.09, 1.53], the latter excluding 1 in all five; Supplementary Table 8a), and the housekeeping floor (k_n ≥ 10⁻⁴) is essentially never reached (Supplementary Note 10). LUAD KRAS identity panels showed no MSigDB Hallmark enrichment </w:t>
+        <w:t xml:space="preserve">Four controls bound the interpretation (Supplementary Note 10). Composition adjustment left the pooled tumor-pair k_n coefficient unchanged (−0.9% pooled, 95% CI −4.3% to +2.5%), and high-purity-half comparisons increased the NN/TT ratio in all five, so admixture can only weaken, not create, the elevation. The softmax mapping on log2(TPM + 1) amounts to a power transform (exponent 1.44); all TCGA statistics were recomputed under the authoritative linear probability mapping (Section 1.7); only LIHC is mapping-sensitive (linear 1.11 [0.94, 1.30] versus softmax 1.29 [1.09, 1.53], the latter excluding 1 in all five; Supplementary Table 8a), and the housekeeping floor is never reached. LUAD KRAS identity panels showed no MSigDB Hallmark enrichment </w:t>
       </w:r>
       <w:r>
         <w:rPr>
@@ -1352,7 +1352,7 @@
           <w:color w:val="000000"/>
           <w:sz w:val="22"/>
         </w:rPr>
-        <w:t xml:space="preserve"> after correction (all q ≥ 0.24), and composition-adjusted regressions retained TT ≥ NN k_f ordering in all five. TCGA “normal” samples are adjacent non-tumor, and per-tumor ω was not associated with survival (ex-CC LIHC Cox, stage categorical: ω HR per SD 1.08 [0.88, 1.33], P = 0.467; k_f likewise null; Supplementary Table 8b): we report all TCGA findings as tissue-level divergence at bulk resolution, pending single-cell validation (reference-free composition check: non-parenchymal fraction versus k_n, ρ = 0.20–0.26; Supplementary Note 10).</w:t>
+        <w:t xml:space="preserve"> (all q ≥ 0.24), and composition-adjusted regressions retained TT ≥ NN k_f ordering in all five. TCGA “normal” samples are adjacent non-tumor, and per-tumor ω was not associated with survival (ex-CC LIHC Cox, stage categorical: ω HR per SD 1.08 [0.88, 1.33], P = 0.467; k_f likewise null; Supplementary Table 8b): we report all TCGA findings as tissue-level divergence at bulk resolution, pending single-cell validation (reference-free composition check: non-parenchymal fraction versus k_n, ρ = 0.20–0.26; Supplementary Note 10).</w:t>
       </w:r>
     </w:p>
     <w:p>
@@ -1368,7 +1368,7 @@
           <w:color w:val="000000"/>
           <w:sz w:val="22"/>
         </w:rPr>
-        <w:t>A GTEx healthy reference supplies the missing external comparison (Supplementary Note 10): in lung, liver, and breast, adjacent-normal k_n is as low as healthy k_n (healthy/adjacent ≈ 1.0–1.2) while tumor k_n is 2.0–2.8-fold higher—adjacent non-tumor resembles healthy tissue, tentatively consistent with tumor-specific elevation rather than a field effect within cohorts. Kidney is the exception (GTEx cortex k_n ≈ tumor; n = 28, high variance). This cross-cohort reference is descriptive only (processing shifts k_n 1.8–2.3-fold).</w:t>
+        <w:t>A GTEx healthy reference supplies the missing external comparison (Supplementary Note 10): in lung, liver, and breast, adjacent-normal k_n matches healthy k_n (ratio ≈ 1.0–1.2) while tumor k_n is 2.0–2.8-fold higher—adjacent non-tumor resembles healthy tissue, tentatively consistent with tumor-specific elevation rather than a field effect within cohorts. Kidney is the exception (GTEx cortex k_n ≈ tumor; n = 28, high variance). This cross-cohort reference is descriptive only (processing shifts k_n 1.8–2.3-fold).</w:t>
       </w:r>
     </w:p>
     <w:p>

</xml_diff>